<commit_message>
Artículo en español v2: PDF y .docx corregido (ecuación 7 con mín{1,…}, subíndices)
Co-Authored-By: Claude Opus 5.5 <noreply@anthropic.com>
</commit_message>
<xml_diff>
--- a/docs/Articulo_Poder_Maritimo_y_Ciberpoder_v2_revisado_2026-10.docx
+++ b/docs/Articulo_Poder_Maritimo_y_Ciberpoder_v2_revisado_2026-10.docx
@@ -2878,7 +2878,7 @@
                 <w:szCs w:val="20"/>
                 <w:lang w:val="es-CO"/>
               </w:rPr>
-              <w:t>i = 1…n;  Σwᵢ = 1;  wᵢ ∈ (0,1];  IM ∈ (0,1]</w:t>
+              <w:t>i = 1…n;  Σwᵢ = 1;  wᵢ ∈ (0,1);  IM ∈ (0,1]</w:t>
             </w:r>
           </w:p>
         </w:tc>
@@ -4628,7 +4628,91 @@
                 <w:sz w:val="20"/>
                 <w:szCs w:val="20"/>
               </w:rPr>
-              <w:t>CP, CS_m, CD_m, CR_m, CDb</w:t>
+              <w:t xml:space="preserve">CP, </w:t>
+            </w:r>
+            <w:r>
+              <w:rPr>
+                <w:i/>
+                <w:iCs/>
+                <w:sz w:val="20"/>
+                <w:szCs w:val="20"/>
+              </w:rPr>
+              <w:t xml:space="preserve">CS</w:t>
+            </w:r>
+            <w:r>
+              <w:rPr>
+                <w:i/>
+                <w:iCs/>
+                <w:sz w:val="20"/>
+                <w:szCs w:val="20"/>
+                <w:vertAlign w:val="subscript"/>
+              </w:rPr>
+              <w:t xml:space="preserve">m</w:t>
+            </w:r>
+            <w:r>
+              <w:rPr>
+                <w:i/>
+                <w:iCs/>
+                <w:sz w:val="20"/>
+                <w:szCs w:val="20"/>
+              </w:rPr>
+              <w:t xml:space="preserve">, </w:t>
+            </w:r>
+            <w:r>
+              <w:rPr>
+                <w:i/>
+                <w:iCs/>
+                <w:sz w:val="20"/>
+                <w:szCs w:val="20"/>
+              </w:rPr>
+              <w:t xml:space="preserve">CD</w:t>
+            </w:r>
+            <w:r>
+              <w:rPr>
+                <w:i/>
+                <w:iCs/>
+                <w:sz w:val="20"/>
+                <w:szCs w:val="20"/>
+                <w:vertAlign w:val="subscript"/>
+              </w:rPr>
+              <w:t xml:space="preserve">m</w:t>
+            </w:r>
+            <w:r>
+              <w:rPr>
+                <w:i/>
+                <w:iCs/>
+                <w:sz w:val="20"/>
+                <w:szCs w:val="20"/>
+              </w:rPr>
+              <w:t xml:space="preserve">, </w:t>
+            </w:r>
+            <w:r>
+              <w:rPr>
+                <w:i/>
+                <w:iCs/>
+                <w:sz w:val="20"/>
+                <w:szCs w:val="20"/>
+              </w:rPr>
+              <w:t xml:space="preserve">CR</w:t>
+            </w:r>
+            <w:r>
+              <w:rPr>
+                <w:i/>
+                <w:iCs/>
+                <w:sz w:val="20"/>
+                <w:szCs w:val="20"/>
+                <w:vertAlign w:val="subscript"/>
+              </w:rPr>
+              <w:t xml:space="preserve">m</w:t>
+            </w:r>
+            <w:r>
+              <w:rPr>
+                <w:i/>
+                <w:iCs/>
+                <w:sz w:val="20"/>
+                <w:szCs w:val="20"/>
+              </w:rPr>
+              <w:t xml:space="preserve">, CDb</w:t>
             </w:r>
             <w:r>
               <w:rPr>
@@ -6697,230 +6781,6 @@
                                 </m:ctrlPr>
                               </m:dPr>
                               <m:e>
-                                <m:d>
-                                  <m:dPr>
-                                    <m:ctrlPr>
-                                      <w:rPr>
-                                        <w:rFonts w:ascii="Cambria Math" w:hAnsi="Cambria Math"/>
-                                      </w:rPr>
-                                    </m:ctrlPr>
-                                  </m:dPr>
-                                  <m:e>
-                                    <m:sSub>
-                                      <m:sSubPr>
-                                        <m:ctrlPr>
-                                          <w:rPr>
-                                            <w:rFonts w:ascii="Cambria Math" w:hAnsi="Cambria Math"/>
-                                          </w:rPr>
-                                        </m:ctrlPr>
-                                      </m:sSubPr>
-                                      <m:e>
-                                        <m:r>
-                                          <w:rPr>
-                                            <w:rFonts w:ascii="Cambria Math" w:hAnsi="Cambria Math"/>
-                                          </w:rPr>
-                                          <m:t>β</m:t>
-                                        </m:r>
-                                      </m:e>
-                                      <m:sub>
-                                        <m:r>
-                                          <m:rPr>
-                                            <m:sty m:val="p"/>
-                                          </m:rPr>
-                                          <w:rPr>
-                                            <w:rFonts w:ascii="Cambria Math" w:hAnsi="Cambria Math"/>
-                                          </w:rPr>
-                                          <m:t>1</m:t>
-                                        </m:r>
-                                      </m:sub>
-                                    </m:sSub>
-                                    <m:r>
-                                      <m:rPr>
-                                        <m:sty m:val="p"/>
-                                      </m:rPr>
-                                      <w:rPr>
-                                        <w:rFonts w:ascii="Cambria Math" w:hAnsi="Cambria Math"/>
-                                      </w:rPr>
-                                      <m:t>·</m:t>
-                                    </m:r>
-                                    <m:sSub>
-                                      <m:sSubPr>
-                                        <m:ctrlPr>
-                                          <w:rPr>
-                                            <w:rFonts w:ascii="Cambria Math" w:hAnsi="Cambria Math"/>
-                                          </w:rPr>
-                                        </m:ctrlPr>
-                                      </m:sSubPr>
-                                      <m:e>
-                                        <m:r>
-                                          <w:rPr>
-                                            <w:rFonts w:ascii="Cambria Math" w:hAnsi="Cambria Math"/>
-                                          </w:rPr>
-                                          <m:t>CS</m:t>
-                                        </m:r>
-                                      </m:e>
-                                      <m:sub>
-                                        <m:r>
-                                          <m:rPr>
-                                            <m:sty m:val="p"/>
-                                          </m:rPr>
-                                          <w:rPr>
-                                            <w:rFonts w:ascii="Cambria Math" w:hAnsi="Cambria Math"/>
-                                          </w:rPr>
-                                          <m:t>m</m:t>
-                                        </m:r>
-                                      </m:sub>
-                                    </m:sSub>
-                                    <m:r>
-                                      <m:rPr>
-                                        <m:sty m:val="p"/>
-                                      </m:rPr>
-                                      <w:rPr>
-                                        <w:rFonts w:ascii="Cambria Math" w:hAnsi="Cambria Math"/>
-                                      </w:rPr>
-                                      <m:t xml:space="preserve"> + </m:t>
-                                    </m:r>
-                                    <m:sSub>
-                                      <m:sSubPr>
-                                        <m:ctrlPr>
-                                          <w:rPr>
-                                            <w:rFonts w:ascii="Cambria Math" w:hAnsi="Cambria Math"/>
-                                          </w:rPr>
-                                        </m:ctrlPr>
-                                      </m:sSubPr>
-                                      <m:e>
-                                        <m:r>
-                                          <w:rPr>
-                                            <w:rFonts w:ascii="Cambria Math" w:hAnsi="Cambria Math"/>
-                                          </w:rPr>
-                                          <m:t>β</m:t>
-                                        </m:r>
-                                      </m:e>
-                                      <m:sub>
-                                        <m:r>
-                                          <m:rPr>
-                                            <m:sty m:val="p"/>
-                                          </m:rPr>
-                                          <w:rPr>
-                                            <w:rFonts w:ascii="Cambria Math" w:hAnsi="Cambria Math"/>
-                                          </w:rPr>
-                                          <m:t>2</m:t>
-                                        </m:r>
-                                      </m:sub>
-                                    </m:sSub>
-                                    <m:r>
-                                      <m:rPr>
-                                        <m:sty m:val="p"/>
-                                      </m:rPr>
-                                      <w:rPr>
-                                        <w:rFonts w:ascii="Cambria Math" w:hAnsi="Cambria Math"/>
-                                      </w:rPr>
-                                      <m:t>·</m:t>
-                                    </m:r>
-                                    <m:sSub>
-                                      <m:sSubPr>
-                                        <m:ctrlPr>
-                                          <w:rPr>
-                                            <w:rFonts w:ascii="Cambria Math" w:hAnsi="Cambria Math"/>
-                                          </w:rPr>
-                                        </m:ctrlPr>
-                                      </m:sSubPr>
-                                      <m:e>
-                                        <m:r>
-                                          <w:rPr>
-                                            <w:rFonts w:ascii="Cambria Math" w:hAnsi="Cambria Math"/>
-                                          </w:rPr>
-                                          <m:t>CD</m:t>
-                                        </m:r>
-                                      </m:e>
-                                      <m:sub>
-                                        <m:r>
-                                          <m:rPr>
-                                            <m:sty m:val="p"/>
-                                          </m:rPr>
-                                          <w:rPr>
-                                            <w:rFonts w:ascii="Cambria Math" w:hAnsi="Cambria Math"/>
-                                          </w:rPr>
-                                          <m:t>m</m:t>
-                                        </m:r>
-                                      </m:sub>
-                                    </m:sSub>
-                                    <m:r>
-                                      <m:rPr>
-                                        <m:sty m:val="p"/>
-                                      </m:rPr>
-                                      <w:rPr>
-                                        <w:rFonts w:ascii="Cambria Math" w:hAnsi="Cambria Math"/>
-                                      </w:rPr>
-                                      <m:t xml:space="preserve"> + </m:t>
-                                    </m:r>
-                                    <m:sSub>
-                                      <m:sSubPr>
-                                        <m:ctrlPr>
-                                          <w:rPr>
-                                            <w:rFonts w:ascii="Cambria Math" w:hAnsi="Cambria Math"/>
-                                          </w:rPr>
-                                        </m:ctrlPr>
-                                      </m:sSubPr>
-                                      <m:e>
-                                        <m:r>
-                                          <w:rPr>
-                                            <w:rFonts w:ascii="Cambria Math" w:hAnsi="Cambria Math"/>
-                                          </w:rPr>
-                                          <m:t>β</m:t>
-                                        </m:r>
-                                      </m:e>
-                                      <m:sub>
-                                        <m:r>
-                                          <m:rPr>
-                                            <m:sty m:val="p"/>
-                                          </m:rPr>
-                                          <w:rPr>
-                                            <w:rFonts w:ascii="Cambria Math" w:hAnsi="Cambria Math"/>
-                                          </w:rPr>
-                                          <m:t>3</m:t>
-                                        </m:r>
-                                      </m:sub>
-                                    </m:sSub>
-                                    <m:r>
-                                      <m:rPr>
-                                        <m:sty m:val="p"/>
-                                      </m:rPr>
-                                      <w:rPr>
-                                        <w:rFonts w:ascii="Cambria Math" w:hAnsi="Cambria Math"/>
-                                      </w:rPr>
-                                      <m:t>·</m:t>
-                                    </m:r>
-                                    <m:sSub>
-                                      <m:sSubPr>
-                                        <m:ctrlPr>
-                                          <w:rPr>
-                                            <w:rFonts w:ascii="Cambria Math" w:hAnsi="Cambria Math"/>
-                                          </w:rPr>
-                                        </m:ctrlPr>
-                                      </m:sSubPr>
-                                      <m:e>
-                                        <m:r>
-                                          <w:rPr>
-                                            <w:rFonts w:ascii="Cambria Math" w:hAnsi="Cambria Math"/>
-                                          </w:rPr>
-                                          <m:t>CR</m:t>
-                                        </m:r>
-                                      </m:e>
-                                      <m:sub>
-                                        <m:r>
-                                          <m:rPr>
-                                            <m:sty m:val="p"/>
-                                          </m:rPr>
-                                          <w:rPr>
-                                            <w:rFonts w:ascii="Cambria Math" w:hAnsi="Cambria Math"/>
-                                          </w:rPr>
-                                          <m:t>m</m:t>
-                                        </m:r>
-                                      </m:sub>
-                                    </m:sSub>
-                                  </m:e>
-                                </m:d>
                                 <m:r>
                                   <m:rPr>
                                     <m:sty m:val="p"/>
@@ -6928,10 +6788,12 @@
                                   <w:rPr>
                                     <w:rFonts w:ascii="Cambria Math" w:hAnsi="Cambria Math"/>
                                   </w:rPr>
-                                  <m:t>·</m:t>
+                                  <m:t xml:space="preserve">mín</m:t>
                                 </m:r>
                                 <m:d>
                                   <m:dPr>
+                                    <m:begChr m:val="{"/>
+                                    <m:endChr m:val="}"/>
                                     <m:ctrlPr>
                                       <w:rPr>
                                         <w:rFonts w:ascii="Cambria Math" w:hAnsi="Cambria Math"/>
@@ -6946,14 +6808,232 @@
                                       <w:rPr>
                                         <w:rFonts w:ascii="Cambria Math" w:hAnsi="Cambria Math"/>
                                       </w:rPr>
-                                      <m:t xml:space="preserve">1 + </m:t>
+                                      <m:t xml:space="preserve">1, </m:t>
                                     </m:r>
-                                    <m:r>
-                                      <w:rPr>
-                                        <w:rFonts w:ascii="Cambria Math" w:hAnsi="Cambria Math"/>
-                                      </w:rPr>
-                                      <m:t>δ</m:t>
-                                    </m:r>
+                                    <m:d>
+                                      <m:dPr>
+                                        <m:ctrlPr>
+                                          <w:rPr>
+                                            <w:rFonts w:ascii="Cambria Math" w:hAnsi="Cambria Math"/>
+                                          </w:rPr>
+                                        </m:ctrlPr>
+                                      </m:dPr>
+                                      <m:e>
+                                        <m:sSub>
+                                          <m:sSubPr>
+                                            <m:ctrlPr>
+                                              <w:rPr>
+                                                <w:rFonts w:ascii="Cambria Math" w:hAnsi="Cambria Math"/>
+                                              </w:rPr>
+                                            </m:ctrlPr>
+                                          </m:sSubPr>
+                                          <m:e>
+                                            <m:r>
+                                              <w:rPr>
+                                                <w:rFonts w:ascii="Cambria Math" w:hAnsi="Cambria Math"/>
+                                              </w:rPr>
+                                              <m:t>β</m:t>
+                                            </m:r>
+                                          </m:e>
+                                          <m:sub>
+                                            <m:r>
+                                              <m:rPr>
+                                                <m:sty m:val="p"/>
+                                              </m:rPr>
+                                              <w:rPr>
+                                                <w:rFonts w:ascii="Cambria Math" w:hAnsi="Cambria Math"/>
+                                              </w:rPr>
+                                              <m:t>1</m:t>
+                                            </m:r>
+                                          </m:sub>
+                                        </m:sSub>
+                                        <m:r>
+                                          <m:rPr>
+                                            <m:sty m:val="p"/>
+                                          </m:rPr>
+                                          <w:rPr>
+                                            <w:rFonts w:ascii="Cambria Math" w:hAnsi="Cambria Math"/>
+                                          </w:rPr>
+                                          <m:t>·</m:t>
+                                        </m:r>
+                                        <m:sSub>
+                                          <m:sSubPr>
+                                            <m:ctrlPr>
+                                              <w:rPr>
+                                                <w:rFonts w:ascii="Cambria Math" w:hAnsi="Cambria Math"/>
+                                              </w:rPr>
+                                            </m:ctrlPr>
+                                          </m:sSubPr>
+                                          <m:e>
+                                            <m:r>
+                                              <w:rPr>
+                                                <w:rFonts w:ascii="Cambria Math" w:hAnsi="Cambria Math"/>
+                                              </w:rPr>
+                                              <m:t>CS</m:t>
+                                            </m:r>
+                                          </m:e>
+                                          <m:sub>
+                                            <m:r>
+                                              <m:rPr>
+                                                <m:sty m:val="p"/>
+                                              </m:rPr>
+                                              <w:rPr>
+                                                <w:rFonts w:ascii="Cambria Math" w:hAnsi="Cambria Math"/>
+                                              </w:rPr>
+                                              <m:t>m</m:t>
+                                            </m:r>
+                                          </m:sub>
+                                        </m:sSub>
+                                        <m:r>
+                                          <m:rPr>
+                                            <m:sty m:val="p"/>
+                                          </m:rPr>
+                                          <w:rPr>
+                                            <w:rFonts w:ascii="Cambria Math" w:hAnsi="Cambria Math"/>
+                                          </w:rPr>
+                                          <m:t xml:space="preserve"> + </m:t>
+                                        </m:r>
+                                        <m:sSub>
+                                          <m:sSubPr>
+                                            <m:ctrlPr>
+                                              <w:rPr>
+                                                <w:rFonts w:ascii="Cambria Math" w:hAnsi="Cambria Math"/>
+                                              </w:rPr>
+                                            </m:ctrlPr>
+                                          </m:sSubPr>
+                                          <m:e>
+                                            <m:r>
+                                              <w:rPr>
+                                                <w:rFonts w:ascii="Cambria Math" w:hAnsi="Cambria Math"/>
+                                              </w:rPr>
+                                              <m:t>β</m:t>
+                                            </m:r>
+                                          </m:e>
+                                          <m:sub>
+                                            <m:r>
+                                              <m:rPr>
+                                                <m:sty m:val="p"/>
+                                              </m:rPr>
+                                              <w:rPr>
+                                                <w:rFonts w:ascii="Cambria Math" w:hAnsi="Cambria Math"/>
+                                              </w:rPr>
+                                              <m:t>2</m:t>
+                                            </m:r>
+                                          </m:sub>
+                                        </m:sSub>
+                                        <m:r>
+                                          <m:rPr>
+                                            <m:sty m:val="p"/>
+                                          </m:rPr>
+                                          <w:rPr>
+                                            <w:rFonts w:ascii="Cambria Math" w:hAnsi="Cambria Math"/>
+                                          </w:rPr>
+                                          <m:t>·</m:t>
+                                        </m:r>
+                                        <m:sSub>
+                                          <m:sSubPr>
+                                            <m:ctrlPr>
+                                              <w:rPr>
+                                                <w:rFonts w:ascii="Cambria Math" w:hAnsi="Cambria Math"/>
+                                              </w:rPr>
+                                            </m:ctrlPr>
+                                          </m:sSubPr>
+                                          <m:e>
+                                            <m:r>
+                                              <w:rPr>
+                                                <w:rFonts w:ascii="Cambria Math" w:hAnsi="Cambria Math"/>
+                                              </w:rPr>
+                                              <m:t>CD</m:t>
+                                            </m:r>
+                                          </m:e>
+                                          <m:sub>
+                                            <m:r>
+                                              <m:rPr>
+                                                <m:sty m:val="p"/>
+                                              </m:rPr>
+                                              <w:rPr>
+                                                <w:rFonts w:ascii="Cambria Math" w:hAnsi="Cambria Math"/>
+                                              </w:rPr>
+                                              <m:t>m</m:t>
+                                            </m:r>
+                                          </m:sub>
+                                        </m:sSub>
+                                        <m:r>
+                                          <m:rPr>
+                                            <m:sty m:val="p"/>
+                                          </m:rPr>
+                                          <w:rPr>
+                                            <w:rFonts w:ascii="Cambria Math" w:hAnsi="Cambria Math"/>
+                                          </w:rPr>
+                                          <m:t xml:space="preserve"> + </m:t>
+                                        </m:r>
+                                        <m:sSub>
+                                          <m:sSubPr>
+                                            <m:ctrlPr>
+                                              <w:rPr>
+                                                <w:rFonts w:ascii="Cambria Math" w:hAnsi="Cambria Math"/>
+                                              </w:rPr>
+                                            </m:ctrlPr>
+                                          </m:sSubPr>
+                                          <m:e>
+                                            <m:r>
+                                              <w:rPr>
+                                                <w:rFonts w:ascii="Cambria Math" w:hAnsi="Cambria Math"/>
+                                              </w:rPr>
+                                              <m:t>β</m:t>
+                                            </m:r>
+                                          </m:e>
+                                          <m:sub>
+                                            <m:r>
+                                              <m:rPr>
+                                                <m:sty m:val="p"/>
+                                              </m:rPr>
+                                              <w:rPr>
+                                                <w:rFonts w:ascii="Cambria Math" w:hAnsi="Cambria Math"/>
+                                              </w:rPr>
+                                              <m:t>3</m:t>
+                                            </m:r>
+                                          </m:sub>
+                                        </m:sSub>
+                                        <m:r>
+                                          <m:rPr>
+                                            <m:sty m:val="p"/>
+                                          </m:rPr>
+                                          <w:rPr>
+                                            <w:rFonts w:ascii="Cambria Math" w:hAnsi="Cambria Math"/>
+                                          </w:rPr>
+                                          <m:t>·</m:t>
+                                        </m:r>
+                                        <m:sSub>
+                                          <m:sSubPr>
+                                            <m:ctrlPr>
+                                              <w:rPr>
+                                                <w:rFonts w:ascii="Cambria Math" w:hAnsi="Cambria Math"/>
+                                              </w:rPr>
+                                            </m:ctrlPr>
+                                          </m:sSubPr>
+                                          <m:e>
+                                            <m:r>
+                                              <w:rPr>
+                                                <w:rFonts w:ascii="Cambria Math" w:hAnsi="Cambria Math"/>
+                                              </w:rPr>
+                                              <m:t>CR</m:t>
+                                            </m:r>
+                                          </m:e>
+                                          <m:sub>
+                                            <m:r>
+                                              <m:rPr>
+                                                <m:sty m:val="p"/>
+                                              </m:rPr>
+                                              <w:rPr>
+                                                <w:rFonts w:ascii="Cambria Math" w:hAnsi="Cambria Math"/>
+                                              </w:rPr>
+                                              <m:t>m</m:t>
+                                            </m:r>
+                                          </m:sub>
+                                        </m:sSub>
+                                      </m:e>
+                                    </m:d>
                                     <m:r>
                                       <m:rPr>
                                         <m:sty m:val="p"/>
@@ -6963,12 +7043,47 @@
                                       </w:rPr>
                                       <m:t>·</m:t>
                                     </m:r>
-                                    <m:r>
-                                      <w:rPr>
-                                        <w:rFonts w:ascii="Cambria Math" w:hAnsi="Cambria Math"/>
-                                      </w:rPr>
-                                      <m:t>CDb</m:t>
-                                    </m:r>
+                                    <m:d>
+                                      <m:dPr>
+                                        <m:ctrlPr>
+                                          <w:rPr>
+                                            <w:rFonts w:ascii="Cambria Math" w:hAnsi="Cambria Math"/>
+                                          </w:rPr>
+                                        </m:ctrlPr>
+                                      </m:dPr>
+                                      <m:e>
+                                        <m:r>
+                                          <m:rPr>
+                                            <m:sty m:val="p"/>
+                                          </m:rPr>
+                                          <w:rPr>
+                                            <w:rFonts w:ascii="Cambria Math" w:hAnsi="Cambria Math"/>
+                                          </w:rPr>
+                                          <m:t xml:space="preserve">1 + </m:t>
+                                        </m:r>
+                                        <m:r>
+                                          <w:rPr>
+                                            <w:rFonts w:ascii="Cambria Math" w:hAnsi="Cambria Math"/>
+                                          </w:rPr>
+                                          <m:t>δ</m:t>
+                                        </m:r>
+                                        <m:r>
+                                          <m:rPr>
+                                            <m:sty m:val="p"/>
+                                          </m:rPr>
+                                          <w:rPr>
+                                            <w:rFonts w:ascii="Cambria Math" w:hAnsi="Cambria Math"/>
+                                          </w:rPr>
+                                          <m:t>·</m:t>
+                                        </m:r>
+                                        <m:r>
+                                          <w:rPr>
+                                            <w:rFonts w:ascii="Cambria Math" w:hAnsi="Cambria Math"/>
+                                          </w:rPr>
+                                          <m:t>CDb</m:t>
+                                        </m:r>
+                                      </m:e>
+                                    </m:d>
                                   </m:e>
                                 </m:d>
                               </m:e>
@@ -13030,7 +13145,20 @@
         <w:rPr>
           <w:lang w:val="es-CO"/>
         </w:rPr>
-        <w:t xml:space="preserve">, de modo que para b pequeño la ganancia es ΔPM_norm ≈ b·ω</w:t>
+        <w:t xml:space="preserve">, de modo que para b pequeño la ganancia es ΔPM</w:t>
+      </w:r>
+      <w:r>
+        <w:rPr>
+          <w:vertAlign w:val="subscript"/>
+          <w:lang w:val="es-CO"/>
+        </w:rPr>
+        <w:t xml:space="preserve">norm</w:t>
+      </w:r>
+      <w:r>
+        <w:rPr>
+          <w:lang w:val="es-CO"/>
+        </w:rPr>
+        <w:t xml:space="preserve"> ≈ b·ω</w:t>
       </w:r>
       <w:r>
         <w:rPr>
@@ -14320,7 +14448,16 @@
                 <w:bCs/>
                 <w:lang w:val="es-CO"/>
               </w:rPr>
-              <w:t xml:space="preserve">ΔPM_norm</w:t>
+              <w:t xml:space="preserve">ΔPM</w:t>
+            </w:r>
+            <w:r>
+              <w:rPr>
+                <w:b/>
+                <w:bCs/>
+                <w:vertAlign w:val="subscript"/>
+                <w:lang w:val="es-CO"/>
+              </w:rPr>
+              <w:t xml:space="preserve">norm</w:t>
             </w:r>
           </w:p>
         </w:tc>
@@ -17337,7 +17474,7 @@
       <w:r>
         <w:drawing>
           <wp:inline xmlns:a="http://schemas.openxmlformats.org/drawingml/2006/main" xmlns:pic="http://schemas.openxmlformats.org/drawingml/2006/picture">
-            <wp:extent cx="5029200" cy="6006210"/>
+            <wp:extent cx="5486400" cy="6552230"/>
             <wp:docPr id="1791909761" name="Picture 1791909761"/>
             <wp:cNvGraphicFramePr>
               <a:graphicFrameLocks noChangeAspect="1"/>
@@ -17358,7 +17495,7 @@
                   <pic:spPr>
                     <a:xfrm>
                       <a:off x="0" y="0"/>
-                      <a:ext cx="5029200" cy="6006210"/>
+                      <a:ext cx="5486400" cy="6552230"/>
                     </a:xfrm>
                     <a:prstGeom prst="rect"/>
                   </pic:spPr>

</xml_diff>

<commit_message>
Artículo en español v2: maquetación final (tablas cortas sin partir, títulos con su párrafo, Figura 2 con su anexo)
Co-Authored-By: Claude Opus 5.5 <noreply@anthropic.com>
</commit_message>
<xml_diff>
--- a/docs/Articulo_Poder_Maritimo_y_Ciberpoder_v2_revisado_2026-10.docx
+++ b/docs/Articulo_Poder_Maritimo_y_Ciberpoder_v2_revisado_2026-10.docx
@@ -44,6 +44,7 @@
     </w:p>
     <w:p>
       <w:pPr>
+        <w:keepNext/>
         <w:spacing w:before="280" w:after="120" w:line="360" w:lineRule="auto"/>
         <w:rPr>
           <w:lang w:val="es-CO"/>
@@ -100,6 +101,7 @@
     </w:p>
     <w:p>
       <w:pPr>
+        <w:keepNext/>
         <w:spacing w:before="280" w:after="120" w:line="360" w:lineRule="auto"/>
         <w:rPr>
           <w:lang w:val="es-CO"/>
@@ -222,6 +224,7 @@
     </w:p>
     <w:p>
       <w:pPr>
+        <w:keepNext/>
         <w:spacing w:before="280" w:after="120" w:line="360" w:lineRule="auto"/>
         <w:rPr>
           <w:lang w:val="es-CO"/>
@@ -240,6 +243,7 @@
     </w:p>
     <w:p>
       <w:pPr>
+        <w:keepNext/>
         <w:spacing w:before="200" w:after="100" w:line="360" w:lineRule="auto"/>
         <w:rPr>
           <w:b/>
@@ -287,6 +291,7 @@
     </w:p>
     <w:p>
       <w:pPr>
+        <w:keepNext/>
         <w:spacing w:before="200" w:after="100" w:line="360" w:lineRule="auto"/>
         <w:rPr>
           <w:b/>
@@ -320,6 +325,7 @@
     </w:p>
     <w:p>
       <w:pPr>
+        <w:keepNext/>
         <w:spacing w:before="200" w:after="100" w:line="360" w:lineRule="auto"/>
         <w:rPr>
           <w:b/>
@@ -382,6 +388,7 @@
     </w:p>
     <w:p>
       <w:pPr>
+        <w:keepNext/>
         <w:spacing w:before="200" w:after="100" w:line="360" w:lineRule="auto"/>
         <w:rPr>
           <w:b/>
@@ -443,6 +450,7 @@
     </w:p>
     <w:p>
       <w:pPr>
+        <w:keepNext/>
         <w:spacing w:before="280" w:after="120" w:line="360" w:lineRule="auto"/>
         <w:rPr>
           <w:lang w:val="es-CO"/>
@@ -476,6 +484,7 @@
     </w:p>
     <w:p>
       <w:pPr>
+        <w:keepNext/>
         <w:spacing w:before="200" w:after="100" w:line="360" w:lineRule="auto"/>
         <w:rPr>
           <w:b/>
@@ -651,6 +660,7 @@
     </w:p>
     <w:p>
       <w:pPr>
+        <w:keepNext/>
         <w:spacing w:before="200" w:after="100" w:line="360" w:lineRule="auto"/>
         <w:rPr>
           <w:b/>
@@ -714,6 +724,7 @@
     </w:p>
     <w:p>
       <w:pPr>
+        <w:keepNext/>
         <w:spacing w:before="200" w:after="100" w:line="360" w:lineRule="auto"/>
         <w:rPr>
           <w:b/>
@@ -769,6 +780,7 @@
     </w:p>
     <w:p>
       <w:pPr>
+        <w:keepNext/>
         <w:spacing w:before="280" w:after="120" w:line="360" w:lineRule="auto"/>
         <w:rPr>
           <w:lang w:val="es-CO"/>
@@ -971,6 +983,7 @@
     </w:p>
     <w:p>
       <w:pPr>
+        <w:keepNext/>
         <w:spacing w:before="280" w:after="120" w:line="360" w:lineRule="auto"/>
         <w:rPr>
           <w:lang w:val="es-CO"/>
@@ -989,6 +1002,7 @@
     </w:p>
     <w:p>
       <w:pPr>
+        <w:keepNext/>
         <w:spacing w:before="200" w:after="100" w:line="360" w:lineRule="auto"/>
         <w:rPr>
           <w:b/>
@@ -2128,6 +2142,7 @@
     </w:p>
     <w:p>
       <w:pPr>
+        <w:keepNext/>
         <w:spacing w:before="200" w:after="100" w:line="360" w:lineRule="auto"/>
         <w:rPr>
           <w:b/>
@@ -2237,6 +2252,7 @@
       </w:tblGrid>
       <w:tr>
         <w:trPr>
+          <w:cantSplit/>
           <w:tblHeader/>
         </w:trPr>
         <w:tc>
@@ -2246,6 +2262,7 @@
           </w:tcPr>
           <w:p>
             <w:pPr>
+              <w:keepNext/>
               <w:spacing w:before="40" w:after="40"/>
               <w:jc w:val="center"/>
             </w:pPr>
@@ -2275,6 +2292,7 @@
           </w:tcPr>
           <w:p>
             <w:pPr>
+              <w:keepNext/>
               <w:spacing w:before="40" w:after="40"/>
               <w:jc w:val="center"/>
             </w:pPr>
@@ -2295,6 +2313,7 @@
           </w:tcPr>
           <w:p>
             <w:pPr>
+              <w:keepNext/>
               <w:spacing w:before="40" w:after="40"/>
               <w:jc w:val="center"/>
             </w:pPr>
@@ -2310,6 +2329,9 @@
         </w:tc>
       </w:tr>
       <w:tr>
+        <w:trPr>
+          <w:cantSplit/>
+        </w:trPr>
         <w:tc>
           <w:tcPr>
             <w:tcW w:w="900" w:type="pct"/>
@@ -2318,6 +2340,7 @@
           </w:tcPr>
           <w:p>
             <w:pPr>
+              <w:keepNext/>
               <w:spacing w:before="40" w:after="40"/>
               <w:jc w:val="center"/>
             </w:pPr>
@@ -2337,6 +2360,7 @@
           </w:tcPr>
           <w:p>
             <w:pPr>
+              <w:keepNext/>
               <w:spacing w:before="40" w:after="40"/>
               <w:jc w:val="center"/>
             </w:pPr>
@@ -2356,6 +2380,7 @@
           </w:tcPr>
           <w:p>
             <w:pPr>
+              <w:keepNext/>
               <w:spacing w:before="40" w:after="40"/>
               <w:jc w:val="center"/>
             </w:pPr>
@@ -2369,6 +2394,9 @@
         </w:tc>
       </w:tr>
       <w:tr>
+        <w:trPr>
+          <w:cantSplit/>
+        </w:trPr>
         <w:tc>
           <w:tcPr>
             <w:tcW w:w="900" w:type="pct"/>
@@ -2377,6 +2405,7 @@
           </w:tcPr>
           <w:p>
             <w:pPr>
+              <w:keepNext/>
               <w:spacing w:before="40" w:after="40"/>
               <w:jc w:val="center"/>
             </w:pPr>
@@ -2396,6 +2425,7 @@
           </w:tcPr>
           <w:p>
             <w:pPr>
+              <w:keepNext/>
               <w:spacing w:before="40" w:after="40"/>
               <w:jc w:val="center"/>
             </w:pPr>
@@ -2415,6 +2445,7 @@
           </w:tcPr>
           <w:p>
             <w:pPr>
+              <w:keepNext/>
               <w:spacing w:before="40" w:after="40"/>
               <w:jc w:val="center"/>
             </w:pPr>
@@ -2428,6 +2459,9 @@
         </w:tc>
       </w:tr>
       <w:tr>
+        <w:trPr>
+          <w:cantSplit/>
+        </w:trPr>
         <w:tc>
           <w:tcPr>
             <w:tcW w:w="900" w:type="pct"/>
@@ -2436,6 +2470,7 @@
           </w:tcPr>
           <w:p>
             <w:pPr>
+              <w:keepNext/>
               <w:spacing w:before="40" w:after="40"/>
               <w:jc w:val="center"/>
             </w:pPr>
@@ -2455,6 +2490,7 @@
           </w:tcPr>
           <w:p>
             <w:pPr>
+              <w:keepNext/>
               <w:spacing w:before="40" w:after="40"/>
               <w:jc w:val="center"/>
             </w:pPr>
@@ -2474,6 +2510,7 @@
           </w:tcPr>
           <w:p>
             <w:pPr>
+              <w:keepNext/>
               <w:spacing w:before="40" w:after="40"/>
               <w:jc w:val="center"/>
             </w:pPr>
@@ -2487,6 +2524,9 @@
         </w:tc>
       </w:tr>
       <w:tr>
+        <w:trPr>
+          <w:cantSplit/>
+        </w:trPr>
         <w:tc>
           <w:tcPr>
             <w:tcW w:w="900" w:type="pct"/>
@@ -2495,6 +2535,7 @@
           </w:tcPr>
           <w:p>
             <w:pPr>
+              <w:keepNext/>
               <w:spacing w:before="40" w:after="40"/>
               <w:jc w:val="center"/>
             </w:pPr>
@@ -2514,6 +2555,7 @@
           </w:tcPr>
           <w:p>
             <w:pPr>
+              <w:keepNext/>
               <w:spacing w:before="40" w:after="40"/>
               <w:jc w:val="center"/>
             </w:pPr>
@@ -2533,6 +2575,7 @@
           </w:tcPr>
           <w:p>
             <w:pPr>
+              <w:keepNext/>
               <w:spacing w:before="40" w:after="40"/>
               <w:jc w:val="center"/>
             </w:pPr>
@@ -2546,6 +2589,9 @@
         </w:tc>
       </w:tr>
       <w:tr>
+        <w:trPr>
+          <w:cantSplit/>
+        </w:trPr>
         <w:tc>
           <w:tcPr>
             <w:tcW w:w="900" w:type="pct"/>
@@ -2629,6 +2675,7 @@
     </w:p>
     <w:p>
       <w:pPr>
+        <w:keepNext/>
         <w:spacing w:before="200" w:after="100" w:line="360" w:lineRule="auto"/>
         <w:rPr>
           <w:b/>
@@ -2662,6 +2709,7 @@
     </w:p>
     <w:p>
       <w:pPr>
+        <w:keepNext/>
         <w:spacing w:before="200" w:after="100" w:line="360" w:lineRule="auto"/>
         <w:rPr>
           <w:b/>
@@ -2981,6 +3029,7 @@
     </w:p>
     <w:p>
       <w:pPr>
+        <w:keepNext/>
         <w:spacing w:before="200" w:after="100" w:line="360" w:lineRule="auto"/>
         <w:rPr>
           <w:b/>
@@ -3207,6 +3256,7 @@
     </w:p>
     <w:p>
       <w:pPr>
+        <w:keepNext/>
         <w:spacing w:before="200" w:after="100" w:line="360" w:lineRule="auto"/>
         <w:rPr>
           <w:b/>
@@ -3673,6 +3723,7 @@
     </w:p>
     <w:p>
       <w:pPr>
+        <w:keepNext/>
         <w:spacing w:before="200" w:after="100" w:line="360" w:lineRule="auto"/>
         <w:rPr>
           <w:b/>
@@ -4174,6 +4225,7 @@
     </w:p>
     <w:p>
       <w:pPr>
+        <w:keepNext/>
         <w:spacing w:before="200" w:after="100" w:line="360" w:lineRule="auto"/>
         <w:rPr>
           <w:b/>
@@ -5103,6 +5155,7 @@
     </w:p>
     <w:p>
       <w:pPr>
+        <w:keepNext/>
         <w:spacing w:before="200" w:after="100" w:line="360" w:lineRule="auto"/>
         <w:rPr>
           <w:b/>
@@ -5197,6 +5250,7 @@
       </w:tblGrid>
       <w:tr>
         <w:trPr>
+          <w:cantSplit/>
           <w:tblHeader/>
         </w:trPr>
         <w:tc>
@@ -5206,6 +5260,7 @@
           </w:tcPr>
           <w:p>
             <w:pPr>
+              <w:keepNext/>
               <w:spacing w:before="40" w:after="40"/>
               <w:jc w:val="center"/>
             </w:pPr>
@@ -5228,6 +5283,7 @@
           </w:tcPr>
           <w:p>
             <w:pPr>
+              <w:keepNext/>
               <w:spacing w:before="40" w:after="40"/>
               <w:jc w:val="center"/>
             </w:pPr>
@@ -5250,6 +5306,7 @@
           </w:tcPr>
           <w:p>
             <w:pPr>
+              <w:keepNext/>
               <w:spacing w:before="40" w:after="40"/>
               <w:jc w:val="center"/>
             </w:pPr>
@@ -5267,6 +5324,9 @@
         </w:tc>
       </w:tr>
       <w:tr>
+        <w:trPr>
+          <w:cantSplit/>
+        </w:trPr>
         <w:tc>
           <w:tcPr>
             <w:tcW w:w="1300" w:type="pct"/>
@@ -5274,6 +5334,7 @@
           </w:tcPr>
           <w:p>
             <w:pPr>
+              <w:keepNext/>
               <w:spacing w:before="40" w:after="40"/>
               <w:jc w:val="left"/>
             </w:pPr>
@@ -5294,6 +5355,7 @@
           </w:tcPr>
           <w:p>
             <w:pPr>
+              <w:keepNext/>
               <w:spacing w:before="40" w:after="40"/>
               <w:jc w:val="left"/>
             </w:pPr>
@@ -5314,6 +5376,7 @@
           </w:tcPr>
           <w:p>
             <w:pPr>
+              <w:keepNext/>
               <w:spacing w:before="40" w:after="40"/>
               <w:jc w:val="left"/>
             </w:pPr>
@@ -5363,6 +5426,9 @@
         </w:tc>
       </w:tr>
       <w:tr>
+        <w:trPr>
+          <w:cantSplit/>
+        </w:trPr>
         <w:tc>
           <w:tcPr>
             <w:tcW w:w="1300" w:type="pct"/>
@@ -5370,6 +5436,7 @@
           </w:tcPr>
           <w:p>
             <w:pPr>
+              <w:keepNext/>
               <w:spacing w:before="40" w:after="40"/>
               <w:jc w:val="left"/>
             </w:pPr>
@@ -5407,6 +5474,7 @@
           </w:tcPr>
           <w:p>
             <w:pPr>
+              <w:keepNext/>
               <w:spacing w:before="40" w:after="40"/>
               <w:jc w:val="left"/>
             </w:pPr>
@@ -5427,6 +5495,7 @@
           </w:tcPr>
           <w:p>
             <w:pPr>
+              <w:keepNext/>
               <w:spacing w:before="40" w:after="40"/>
               <w:jc w:val="left"/>
             </w:pPr>
@@ -5459,6 +5528,9 @@
         </w:tc>
       </w:tr>
       <w:tr>
+        <w:trPr>
+          <w:cantSplit/>
+        </w:trPr>
         <w:tc>
           <w:tcPr>
             <w:tcW w:w="1300" w:type="pct"/>
@@ -5466,6 +5538,7 @@
           </w:tcPr>
           <w:p>
             <w:pPr>
+              <w:keepNext/>
               <w:spacing w:before="40" w:after="40"/>
               <w:jc w:val="left"/>
             </w:pPr>
@@ -5503,6 +5576,7 @@
           </w:tcPr>
           <w:p>
             <w:pPr>
+              <w:keepNext/>
               <w:spacing w:before="40" w:after="40"/>
               <w:jc w:val="left"/>
             </w:pPr>
@@ -5523,6 +5597,7 @@
           </w:tcPr>
           <w:p>
             <w:pPr>
+              <w:keepNext/>
               <w:spacing w:before="40" w:after="40"/>
               <w:jc w:val="left"/>
             </w:pPr>
@@ -5538,6 +5613,9 @@
         </w:tc>
       </w:tr>
       <w:tr>
+        <w:trPr>
+          <w:cantSplit/>
+        </w:trPr>
         <w:tc>
           <w:tcPr>
             <w:tcW w:w="1300" w:type="pct"/>
@@ -5545,6 +5623,7 @@
           </w:tcPr>
           <w:p>
             <w:pPr>
+              <w:keepNext/>
               <w:spacing w:before="40" w:after="40"/>
               <w:jc w:val="left"/>
             </w:pPr>
@@ -5582,6 +5661,7 @@
           </w:tcPr>
           <w:p>
             <w:pPr>
+              <w:keepNext/>
               <w:spacing w:before="40" w:after="40"/>
               <w:jc w:val="left"/>
             </w:pPr>
@@ -5602,6 +5682,7 @@
           </w:tcPr>
           <w:p>
             <w:pPr>
+              <w:keepNext/>
               <w:spacing w:before="40" w:after="40"/>
               <w:jc w:val="left"/>
             </w:pPr>
@@ -5634,6 +5715,9 @@
         </w:tc>
       </w:tr>
       <w:tr>
+        <w:trPr>
+          <w:cantSplit/>
+        </w:trPr>
         <w:tc>
           <w:tcPr>
             <w:tcW w:w="1300" w:type="pct"/>
@@ -5641,6 +5725,7 @@
           </w:tcPr>
           <w:p>
             <w:pPr>
+              <w:keepNext/>
               <w:spacing w:before="40" w:after="40"/>
               <w:jc w:val="left"/>
             </w:pPr>
@@ -5661,6 +5746,7 @@
           </w:tcPr>
           <w:p>
             <w:pPr>
+              <w:keepNext/>
               <w:spacing w:before="40" w:after="40"/>
               <w:jc w:val="left"/>
             </w:pPr>
@@ -5681,6 +5767,7 @@
           </w:tcPr>
           <w:p>
             <w:pPr>
+              <w:keepNext/>
               <w:spacing w:before="40" w:after="40"/>
               <w:jc w:val="left"/>
             </w:pPr>
@@ -5713,6 +5800,9 @@
         </w:tc>
       </w:tr>
       <w:tr>
+        <w:trPr>
+          <w:cantSplit/>
+        </w:trPr>
         <w:tc>
           <w:tcPr>
             <w:tcW w:w="1300" w:type="pct"/>
@@ -5720,6 +5810,7 @@
           </w:tcPr>
           <w:p>
             <w:pPr>
+              <w:keepNext/>
               <w:spacing w:before="40" w:after="40"/>
               <w:jc w:val="left"/>
             </w:pPr>
@@ -5740,6 +5831,7 @@
           </w:tcPr>
           <w:p>
             <w:pPr>
+              <w:keepNext/>
               <w:spacing w:before="40" w:after="40"/>
               <w:jc w:val="left"/>
             </w:pPr>
@@ -5760,6 +5852,7 @@
           </w:tcPr>
           <w:p>
             <w:pPr>
+              <w:keepNext/>
               <w:spacing w:before="40" w:after="40"/>
               <w:jc w:val="left"/>
             </w:pPr>
@@ -5792,6 +5885,9 @@
         </w:tc>
       </w:tr>
       <w:tr>
+        <w:trPr>
+          <w:cantSplit/>
+        </w:trPr>
         <w:tc>
           <w:tcPr>
             <w:tcW w:w="1300" w:type="pct"/>
@@ -5799,6 +5895,7 @@
           </w:tcPr>
           <w:p>
             <w:pPr>
+              <w:keepNext/>
               <w:spacing w:before="40" w:after="40"/>
               <w:jc w:val="left"/>
             </w:pPr>
@@ -5819,6 +5916,7 @@
           </w:tcPr>
           <w:p>
             <w:pPr>
+              <w:keepNext/>
               <w:spacing w:before="40" w:after="40"/>
               <w:jc w:val="left"/>
             </w:pPr>
@@ -5839,6 +5937,7 @@
           </w:tcPr>
           <w:p>
             <w:pPr>
+              <w:keepNext/>
               <w:spacing w:before="40" w:after="40"/>
               <w:jc w:val="left"/>
             </w:pPr>
@@ -5854,6 +5953,9 @@
         </w:tc>
       </w:tr>
       <w:tr>
+        <w:trPr>
+          <w:cantSplit/>
+        </w:trPr>
         <w:tc>
           <w:tcPr>
             <w:tcW w:w="1300" w:type="pct"/>
@@ -5940,6 +6042,7 @@
     </w:p>
     <w:p>
       <w:pPr>
+        <w:keepNext/>
         <w:spacing w:before="200" w:after="100" w:line="360" w:lineRule="auto"/>
         <w:rPr>
           <w:b/>
@@ -7792,6 +7895,7 @@
     </w:p>
     <w:p>
       <w:pPr>
+        <w:keepNext/>
         <w:spacing w:before="200" w:after="100" w:line="360" w:lineRule="auto"/>
         <w:rPr>
           <w:b/>
@@ -8949,6 +9053,7 @@
     </w:p>
     <w:p>
       <w:pPr>
+        <w:keepNext/>
         <w:spacing w:before="200" w:after="100" w:line="360" w:lineRule="auto"/>
         <w:rPr>
           <w:b/>
@@ -10173,6 +10278,7 @@
     </w:p>
     <w:p>
       <w:pPr>
+        <w:keepNext/>
         <w:spacing w:before="200" w:after="100" w:line="360" w:lineRule="auto"/>
         <w:rPr>
           <w:b/>
@@ -10330,6 +10436,7 @@
     </w:p>
     <w:p>
       <w:pPr>
+        <w:keepNext/>
         <w:spacing w:before="280" w:after="120" w:line="360" w:lineRule="auto"/>
         <w:rPr>
           <w:lang w:val="es-CO"/>
@@ -10348,6 +10455,7 @@
     </w:p>
     <w:p>
       <w:pPr>
+        <w:keepNext/>
         <w:spacing w:before="200" w:after="100" w:line="360" w:lineRule="auto"/>
         <w:rPr>
           <w:b/>
@@ -10480,6 +10588,7 @@
     </w:p>
     <w:p>
       <w:pPr>
+        <w:keepNext/>
         <w:spacing w:before="200" w:after="100" w:line="360" w:lineRule="auto"/>
         <w:rPr>
           <w:b/>
@@ -10568,6 +10677,7 @@
     </w:p>
     <w:p>
       <w:pPr>
+        <w:keepNext/>
         <w:spacing w:before="200" w:after="100" w:line="360" w:lineRule="auto"/>
         <w:rPr>
           <w:b/>
@@ -10601,6 +10711,7 @@
     </w:p>
     <w:p>
       <w:pPr>
+        <w:keepNext/>
         <w:spacing w:before="200" w:after="100" w:line="360" w:lineRule="auto"/>
         <w:rPr>
           <w:b/>
@@ -10634,6 +10745,7 @@
     </w:p>
     <w:p>
       <w:pPr>
+        <w:keepNext/>
         <w:spacing w:before="200" w:after="100" w:line="360" w:lineRule="auto"/>
         <w:rPr>
           <w:b/>
@@ -10749,6 +10861,7 @@
     </w:p>
     <w:p>
       <w:pPr>
+        <w:keepNext/>
         <w:spacing w:before="280" w:after="120" w:line="360" w:lineRule="auto"/>
         <w:rPr>
           <w:lang w:val="es-CO"/>
@@ -10905,6 +11018,7 @@
     </w:p>
     <w:p>
       <w:pPr>
+        <w:keepNext/>
         <w:spacing w:before="280" w:after="120" w:line="360" w:lineRule="auto"/>
         <w:rPr>
           <w:lang w:val="es-CO"/>
@@ -12646,6 +12760,7 @@
     </w:p>
     <w:p>
       <w:pPr>
+        <w:keepNext/>
         <w:spacing w:before="280" w:after="120" w:line="360" w:lineRule="auto"/>
         <w:jc w:val="center"/>
         <w:rPr>
@@ -13293,6 +13408,7 @@
     </w:p>
     <w:p>
       <w:pPr>
+        <w:keepNext/>
         <w:spacing w:before="200" w:after="100" w:line="360" w:lineRule="auto"/>
         <w:rPr>
           <w:b/>
@@ -13366,6 +13482,7 @@
       </w:tblGrid>
       <w:tr>
         <w:trPr>
+          <w:cantSplit/>
           <w:tblHeader/>
         </w:trPr>
         <w:tc>
@@ -13375,6 +13492,7 @@
           </w:tcPr>
           <w:p>
             <w:pPr>
+              <w:keepNext/>
               <w:spacing w:before="40" w:after="40"/>
               <w:jc w:val="center"/>
             </w:pPr>
@@ -13397,6 +13515,7 @@
           </w:tcPr>
           <w:p>
             <w:pPr>
+              <w:keepNext/>
               <w:spacing w:before="40" w:after="40"/>
               <w:jc w:val="center"/>
             </w:pPr>
@@ -13419,6 +13538,7 @@
           </w:tcPr>
           <w:p>
             <w:pPr>
+              <w:keepNext/>
               <w:spacing w:before="40" w:after="40"/>
               <w:jc w:val="center"/>
             </w:pPr>
@@ -13436,6 +13556,9 @@
         </w:tc>
       </w:tr>
       <w:tr>
+        <w:trPr>
+          <w:cantSplit/>
+        </w:trPr>
         <w:tc>
           <w:tcPr>
             <w:tcW w:w="2200" w:type="pct"/>
@@ -13443,6 +13566,7 @@
           </w:tcPr>
           <w:p>
             <w:pPr>
+              <w:keepNext/>
               <w:spacing w:before="40" w:after="40"/>
               <w:jc w:val="left"/>
             </w:pPr>
@@ -13480,6 +13604,7 @@
           </w:tcPr>
           <w:p>
             <w:pPr>
+              <w:keepNext/>
               <w:spacing w:before="40" w:after="40"/>
               <w:jc w:val="left"/>
             </w:pPr>
@@ -13517,6 +13642,7 @@
           </w:tcPr>
           <w:p>
             <w:pPr>
+              <w:keepNext/>
               <w:spacing w:before="40" w:after="40"/>
               <w:jc w:val="left"/>
             </w:pPr>
@@ -13532,6 +13658,9 @@
         </w:tc>
       </w:tr>
       <w:tr>
+        <w:trPr>
+          <w:cantSplit/>
+        </w:trPr>
         <w:tc>
           <w:tcPr>
             <w:tcW w:w="2200" w:type="pct"/>
@@ -13539,6 +13668,7 @@
           </w:tcPr>
           <w:p>
             <w:pPr>
+              <w:keepNext/>
               <w:spacing w:before="40" w:after="40"/>
               <w:jc w:val="left"/>
             </w:pPr>
@@ -13576,6 +13706,7 @@
           </w:tcPr>
           <w:p>
             <w:pPr>
+              <w:keepNext/>
               <w:spacing w:before="40" w:after="40"/>
               <w:jc w:val="left"/>
             </w:pPr>
@@ -13613,6 +13744,7 @@
           </w:tcPr>
           <w:p>
             <w:pPr>
+              <w:keepNext/>
               <w:spacing w:before="40" w:after="40"/>
               <w:jc w:val="left"/>
             </w:pPr>
@@ -13628,6 +13760,9 @@
         </w:tc>
       </w:tr>
       <w:tr>
+        <w:trPr>
+          <w:cantSplit/>
+        </w:trPr>
         <w:tc>
           <w:tcPr>
             <w:tcW w:w="2200" w:type="pct"/>
@@ -13635,6 +13770,7 @@
           </w:tcPr>
           <w:p>
             <w:pPr>
+              <w:keepNext/>
               <w:spacing w:before="40" w:after="40"/>
               <w:jc w:val="left"/>
             </w:pPr>
@@ -13672,6 +13808,7 @@
           </w:tcPr>
           <w:p>
             <w:pPr>
+              <w:keepNext/>
               <w:spacing w:before="40" w:after="40"/>
               <w:jc w:val="left"/>
             </w:pPr>
@@ -13709,6 +13846,7 @@
           </w:tcPr>
           <w:p>
             <w:pPr>
+              <w:keepNext/>
               <w:spacing w:before="40" w:after="40"/>
               <w:jc w:val="left"/>
             </w:pPr>
@@ -13724,6 +13862,9 @@
         </w:tc>
       </w:tr>
       <w:tr>
+        <w:trPr>
+          <w:cantSplit/>
+        </w:trPr>
         <w:tc>
           <w:tcPr>
             <w:tcW w:w="2200" w:type="pct"/>
@@ -13731,6 +13872,7 @@
           </w:tcPr>
           <w:p>
             <w:pPr>
+              <w:keepNext/>
               <w:spacing w:before="40" w:after="40"/>
               <w:jc w:val="left"/>
             </w:pPr>
@@ -13828,6 +13970,7 @@
           </w:tcPr>
           <w:p>
             <w:pPr>
+              <w:keepNext/>
               <w:spacing w:before="40" w:after="40"/>
               <w:jc w:val="left"/>
             </w:pPr>
@@ -13848,6 +13991,7 @@
           </w:tcPr>
           <w:p>
             <w:pPr>
+              <w:keepNext/>
               <w:spacing w:before="40" w:after="40"/>
               <w:jc w:val="left"/>
             </w:pPr>
@@ -13863,6 +14007,9 @@
         </w:tc>
       </w:tr>
       <w:tr>
+        <w:trPr>
+          <w:cantSplit/>
+        </w:trPr>
         <w:tc>
           <w:tcPr>
             <w:tcW w:w="2200" w:type="pct"/>
@@ -13870,6 +14017,7 @@
           </w:tcPr>
           <w:p>
             <w:pPr>
+              <w:keepNext/>
               <w:spacing w:before="40" w:after="40"/>
               <w:jc w:val="left"/>
             </w:pPr>
@@ -13907,6 +14055,7 @@
           </w:tcPr>
           <w:p>
             <w:pPr>
+              <w:keepNext/>
               <w:spacing w:before="40" w:after="40"/>
               <w:jc w:val="left"/>
             </w:pPr>
@@ -13961,6 +14110,7 @@
           </w:tcPr>
           <w:p>
             <w:pPr>
+              <w:keepNext/>
               <w:spacing w:before="40" w:after="40"/>
               <w:jc w:val="left"/>
             </w:pPr>
@@ -13976,6 +14126,9 @@
         </w:tc>
       </w:tr>
       <w:tr>
+        <w:trPr>
+          <w:cantSplit/>
+        </w:trPr>
         <w:tc>
           <w:tcPr>
             <w:tcW w:w="2200" w:type="pct"/>
@@ -13983,6 +14136,7 @@
           </w:tcPr>
           <w:p>
             <w:pPr>
+              <w:keepNext/>
               <w:spacing w:before="40" w:after="40"/>
               <w:jc w:val="left"/>
             </w:pPr>
@@ -14020,6 +14174,7 @@
           </w:tcPr>
           <w:p>
             <w:pPr>
+              <w:keepNext/>
               <w:spacing w:before="40" w:after="40"/>
               <w:jc w:val="left"/>
             </w:pPr>
@@ -14040,6 +14195,7 @@
           </w:tcPr>
           <w:p>
             <w:pPr>
+              <w:keepNext/>
               <w:spacing w:before="40" w:after="40"/>
               <w:jc w:val="left"/>
             </w:pPr>
@@ -14055,6 +14211,9 @@
         </w:tc>
       </w:tr>
       <w:tr>
+        <w:trPr>
+          <w:cantSplit/>
+        </w:trPr>
         <w:tc>
           <w:tcPr>
             <w:tcW w:w="2200" w:type="pct"/>
@@ -14062,6 +14221,7 @@
           </w:tcPr>
           <w:p>
             <w:pPr>
+              <w:keepNext/>
               <w:spacing w:before="40" w:after="40"/>
               <w:jc w:val="left"/>
             </w:pPr>
@@ -14082,6 +14242,7 @@
           </w:tcPr>
           <w:p>
             <w:pPr>
+              <w:keepNext/>
               <w:spacing w:before="40" w:after="40"/>
               <w:jc w:val="left"/>
             </w:pPr>
@@ -14102,6 +14263,7 @@
           </w:tcPr>
           <w:p>
             <w:pPr>
+              <w:keepNext/>
               <w:spacing w:before="40" w:after="40"/>
               <w:jc w:val="left"/>
             </w:pPr>
@@ -14117,6 +14279,9 @@
         </w:tc>
       </w:tr>
       <w:tr>
+        <w:trPr>
+          <w:cantSplit/>
+        </w:trPr>
         <w:tc>
           <w:tcPr>
             <w:tcW w:w="2200" w:type="pct"/>
@@ -14261,6 +14426,7 @@
     </w:p>
     <w:p>
       <w:pPr>
+        <w:keepNext/>
         <w:spacing w:before="200" w:after="100" w:line="360" w:lineRule="auto"/>
         <w:rPr>
           <w:b/>
@@ -14370,6 +14536,7 @@
       </w:tblGrid>
       <w:tr>
         <w:trPr>
+          <w:cantSplit/>
           <w:tblHeader/>
         </w:trPr>
         <w:tc>
@@ -14379,6 +14546,7 @@
           </w:tcPr>
           <w:p>
             <w:pPr>
+              <w:keepNext/>
               <w:spacing w:before="40" w:after="40"/>
               <w:jc w:val="center"/>
             </w:pPr>
@@ -14399,6 +14567,7 @@
           </w:tcPr>
           <w:p>
             <w:pPr>
+              <w:keepNext/>
               <w:spacing w:before="40" w:after="40"/>
               <w:jc w:val="center"/>
             </w:pPr>
@@ -14419,6 +14588,7 @@
           </w:tcPr>
           <w:p>
             <w:pPr>
+              <w:keepNext/>
               <w:spacing w:before="40" w:after="40"/>
               <w:jc w:val="center"/>
             </w:pPr>
@@ -14439,6 +14609,7 @@
           </w:tcPr>
           <w:p>
             <w:pPr>
+              <w:keepNext/>
               <w:spacing w:before="40" w:after="40"/>
               <w:jc w:val="center"/>
             </w:pPr>
@@ -14468,6 +14639,7 @@
           </w:tcPr>
           <w:p>
             <w:pPr>
+              <w:keepNext/>
               <w:spacing w:before="40" w:after="40"/>
               <w:jc w:val="center"/>
             </w:pPr>
@@ -14492,6 +14664,9 @@
         </w:tc>
       </w:tr>
       <w:tr>
+        <w:trPr>
+          <w:cantSplit/>
+        </w:trPr>
         <w:tc>
           <w:tcPr>
             <w:tcW w:w="1600" w:type="pct"/>
@@ -14499,6 +14674,7 @@
           </w:tcPr>
           <w:p>
             <w:pPr>
+              <w:keepNext/>
               <w:spacing w:before="40" w:after="40"/>
               <w:jc w:val="center"/>
             </w:pPr>
@@ -14517,6 +14693,7 @@
           </w:tcPr>
           <w:p>
             <w:pPr>
+              <w:keepNext/>
               <w:spacing w:before="40" w:after="40"/>
               <w:jc w:val="center"/>
             </w:pPr>
@@ -14535,6 +14712,7 @@
           </w:tcPr>
           <w:p>
             <w:pPr>
+              <w:keepNext/>
               <w:spacing w:before="40" w:after="40"/>
               <w:jc w:val="center"/>
             </w:pPr>
@@ -14553,6 +14731,7 @@
           </w:tcPr>
           <w:p>
             <w:pPr>
+              <w:keepNext/>
               <w:spacing w:before="40" w:after="40"/>
               <w:jc w:val="center"/>
             </w:pPr>
@@ -14571,6 +14750,7 @@
           </w:tcPr>
           <w:p>
             <w:pPr>
+              <w:keepNext/>
               <w:spacing w:before="40" w:after="40"/>
               <w:jc w:val="center"/>
             </w:pPr>
@@ -14584,6 +14764,9 @@
         </w:tc>
       </w:tr>
       <w:tr>
+        <w:trPr>
+          <w:cantSplit/>
+        </w:trPr>
         <w:tc>
           <w:tcPr>
             <w:tcW w:w="1600" w:type="pct"/>
@@ -14591,6 +14774,7 @@
           </w:tcPr>
           <w:p>
             <w:pPr>
+              <w:keepNext/>
               <w:spacing w:before="40" w:after="40"/>
               <w:jc w:val="center"/>
             </w:pPr>
@@ -14609,6 +14793,7 @@
           </w:tcPr>
           <w:p>
             <w:pPr>
+              <w:keepNext/>
               <w:spacing w:before="40" w:after="40"/>
               <w:jc w:val="center"/>
             </w:pPr>
@@ -14627,6 +14812,7 @@
           </w:tcPr>
           <w:p>
             <w:pPr>
+              <w:keepNext/>
               <w:spacing w:before="40" w:after="40"/>
               <w:jc w:val="center"/>
             </w:pPr>
@@ -14645,6 +14831,7 @@
           </w:tcPr>
           <w:p>
             <w:pPr>
+              <w:keepNext/>
               <w:spacing w:before="40" w:after="40"/>
               <w:jc w:val="center"/>
             </w:pPr>
@@ -14663,6 +14850,7 @@
           </w:tcPr>
           <w:p>
             <w:pPr>
+              <w:keepNext/>
               <w:spacing w:before="40" w:after="40"/>
               <w:jc w:val="center"/>
             </w:pPr>
@@ -14676,6 +14864,9 @@
         </w:tc>
       </w:tr>
       <w:tr>
+        <w:trPr>
+          <w:cantSplit/>
+        </w:trPr>
         <w:tc>
           <w:tcPr>
             <w:tcW w:w="1600" w:type="pct"/>
@@ -14683,6 +14874,7 @@
           </w:tcPr>
           <w:p>
             <w:pPr>
+              <w:keepNext/>
               <w:spacing w:before="40" w:after="40"/>
               <w:jc w:val="center"/>
             </w:pPr>
@@ -14701,6 +14893,7 @@
           </w:tcPr>
           <w:p>
             <w:pPr>
+              <w:keepNext/>
               <w:spacing w:before="40" w:after="40"/>
               <w:jc w:val="center"/>
             </w:pPr>
@@ -14719,6 +14912,7 @@
           </w:tcPr>
           <w:p>
             <w:pPr>
+              <w:keepNext/>
               <w:spacing w:before="40" w:after="40"/>
               <w:jc w:val="center"/>
             </w:pPr>
@@ -14737,6 +14931,7 @@
           </w:tcPr>
           <w:p>
             <w:pPr>
+              <w:keepNext/>
               <w:spacing w:before="40" w:after="40"/>
               <w:jc w:val="center"/>
             </w:pPr>
@@ -14755,6 +14950,7 @@
           </w:tcPr>
           <w:p>
             <w:pPr>
+              <w:keepNext/>
               <w:spacing w:before="40" w:after="40"/>
               <w:jc w:val="center"/>
             </w:pPr>
@@ -14768,6 +14964,9 @@
         </w:tc>
       </w:tr>
       <w:tr>
+        <w:trPr>
+          <w:cantSplit/>
+        </w:trPr>
         <w:tc>
           <w:tcPr>
             <w:tcW w:w="1600" w:type="pct"/>
@@ -14775,6 +14974,7 @@
           </w:tcPr>
           <w:p>
             <w:pPr>
+              <w:keepNext/>
               <w:spacing w:before="40" w:after="40"/>
               <w:jc w:val="center"/>
             </w:pPr>
@@ -14793,6 +14993,7 @@
           </w:tcPr>
           <w:p>
             <w:pPr>
+              <w:keepNext/>
               <w:spacing w:before="40" w:after="40"/>
               <w:jc w:val="center"/>
             </w:pPr>
@@ -14811,6 +15012,7 @@
           </w:tcPr>
           <w:p>
             <w:pPr>
+              <w:keepNext/>
               <w:spacing w:before="40" w:after="40"/>
               <w:jc w:val="center"/>
             </w:pPr>
@@ -14829,6 +15031,7 @@
           </w:tcPr>
           <w:p>
             <w:pPr>
+              <w:keepNext/>
               <w:spacing w:before="40" w:after="40"/>
               <w:jc w:val="center"/>
             </w:pPr>
@@ -14847,6 +15050,7 @@
           </w:tcPr>
           <w:p>
             <w:pPr>
+              <w:keepNext/>
               <w:spacing w:before="40" w:after="40"/>
               <w:jc w:val="center"/>
             </w:pPr>
@@ -14860,6 +15064,9 @@
         </w:tc>
       </w:tr>
       <w:tr>
+        <w:trPr>
+          <w:cantSplit/>
+        </w:trPr>
         <w:tc>
           <w:tcPr>
             <w:tcW w:w="1600" w:type="pct"/>
@@ -15143,6 +15350,7 @@
     </w:p>
     <w:p>
       <w:pPr>
+        <w:keepNext/>
         <w:spacing w:before="200" w:after="100" w:line="360" w:lineRule="auto"/>
         <w:rPr>
           <w:b/>
@@ -15238,6 +15446,7 @@
       </w:tblGrid>
       <w:tr>
         <w:trPr>
+          <w:cantSplit/>
           <w:tblHeader/>
         </w:trPr>
         <w:tc>
@@ -15247,6 +15456,7 @@
           </w:tcPr>
           <w:p>
             <w:pPr>
+              <w:keepNext/>
               <w:spacing w:before="40" w:after="40"/>
               <w:jc w:val="center"/>
             </w:pPr>
@@ -15267,6 +15477,7 @@
           </w:tcPr>
           <w:p>
             <w:pPr>
+              <w:keepNext/>
               <w:spacing w:before="40" w:after="40"/>
               <w:jc w:val="center"/>
             </w:pPr>
@@ -15287,6 +15498,7 @@
           </w:tcPr>
           <w:p>
             <w:pPr>
+              <w:keepNext/>
               <w:spacing w:before="40" w:after="40"/>
               <w:jc w:val="center"/>
             </w:pPr>
@@ -15307,6 +15519,7 @@
           </w:tcPr>
           <w:p>
             <w:pPr>
+              <w:keepNext/>
               <w:spacing w:before="40" w:after="40"/>
               <w:jc w:val="center"/>
             </w:pPr>
@@ -15322,6 +15535,9 @@
         </w:tc>
       </w:tr>
       <w:tr>
+        <w:trPr>
+          <w:cantSplit/>
+        </w:trPr>
         <w:tc>
           <w:tcPr>
             <w:tcW w:w="1400" w:type="pct"/>
@@ -15329,6 +15545,7 @@
           </w:tcPr>
           <w:p>
             <w:pPr>
+              <w:keepNext/>
               <w:spacing w:before="40" w:after="40"/>
               <w:jc w:val="center"/>
             </w:pPr>
@@ -15347,6 +15564,7 @@
           </w:tcPr>
           <w:p>
             <w:pPr>
+              <w:keepNext/>
               <w:spacing w:before="40" w:after="40"/>
               <w:jc w:val="center"/>
             </w:pPr>
@@ -15365,6 +15583,7 @@
           </w:tcPr>
           <w:p>
             <w:pPr>
+              <w:keepNext/>
               <w:spacing w:before="40" w:after="40"/>
               <w:jc w:val="center"/>
             </w:pPr>
@@ -15383,6 +15602,7 @@
           </w:tcPr>
           <w:p>
             <w:pPr>
+              <w:keepNext/>
               <w:spacing w:before="40" w:after="40"/>
               <w:jc w:val="center"/>
             </w:pPr>
@@ -15396,6 +15616,9 @@
         </w:tc>
       </w:tr>
       <w:tr>
+        <w:trPr>
+          <w:cantSplit/>
+        </w:trPr>
         <w:tc>
           <w:tcPr>
             <w:tcW w:w="1400" w:type="pct"/>
@@ -15403,6 +15626,7 @@
           </w:tcPr>
           <w:p>
             <w:pPr>
+              <w:keepNext/>
               <w:spacing w:before="40" w:after="40"/>
               <w:jc w:val="center"/>
             </w:pPr>
@@ -15421,6 +15645,7 @@
           </w:tcPr>
           <w:p>
             <w:pPr>
+              <w:keepNext/>
               <w:spacing w:before="40" w:after="40"/>
               <w:jc w:val="center"/>
             </w:pPr>
@@ -15439,6 +15664,7 @@
           </w:tcPr>
           <w:p>
             <w:pPr>
+              <w:keepNext/>
               <w:spacing w:before="40" w:after="40"/>
               <w:jc w:val="center"/>
             </w:pPr>
@@ -15457,6 +15683,7 @@
           </w:tcPr>
           <w:p>
             <w:pPr>
+              <w:keepNext/>
               <w:spacing w:before="40" w:after="40"/>
               <w:jc w:val="center"/>
             </w:pPr>
@@ -15470,6 +15697,9 @@
         </w:tc>
       </w:tr>
       <w:tr>
+        <w:trPr>
+          <w:cantSplit/>
+        </w:trPr>
         <w:tc>
           <w:tcPr>
             <w:tcW w:w="1400" w:type="pct"/>
@@ -15477,6 +15707,7 @@
           </w:tcPr>
           <w:p>
             <w:pPr>
+              <w:keepNext/>
               <w:spacing w:before="40" w:after="40"/>
               <w:jc w:val="center"/>
             </w:pPr>
@@ -15495,6 +15726,7 @@
           </w:tcPr>
           <w:p>
             <w:pPr>
+              <w:keepNext/>
               <w:spacing w:before="40" w:after="40"/>
               <w:jc w:val="center"/>
             </w:pPr>
@@ -15513,6 +15745,7 @@
           </w:tcPr>
           <w:p>
             <w:pPr>
+              <w:keepNext/>
               <w:spacing w:before="40" w:after="40"/>
               <w:jc w:val="center"/>
             </w:pPr>
@@ -15531,6 +15764,7 @@
           </w:tcPr>
           <w:p>
             <w:pPr>
+              <w:keepNext/>
               <w:spacing w:before="40" w:after="40"/>
               <w:jc w:val="center"/>
             </w:pPr>
@@ -15544,6 +15778,9 @@
         </w:tc>
       </w:tr>
       <w:tr>
+        <w:trPr>
+          <w:cantSplit/>
+        </w:trPr>
         <w:tc>
           <w:tcPr>
             <w:tcW w:w="1400" w:type="pct"/>
@@ -15551,6 +15788,7 @@
           </w:tcPr>
           <w:p>
             <w:pPr>
+              <w:keepNext/>
               <w:spacing w:before="40" w:after="40"/>
               <w:jc w:val="center"/>
             </w:pPr>
@@ -15569,6 +15807,7 @@
           </w:tcPr>
           <w:p>
             <w:pPr>
+              <w:keepNext/>
               <w:spacing w:before="40" w:after="40"/>
               <w:jc w:val="center"/>
             </w:pPr>
@@ -15587,6 +15826,7 @@
           </w:tcPr>
           <w:p>
             <w:pPr>
+              <w:keepNext/>
               <w:spacing w:before="40" w:after="40"/>
               <w:jc w:val="center"/>
             </w:pPr>
@@ -15605,6 +15845,7 @@
           </w:tcPr>
           <w:p>
             <w:pPr>
+              <w:keepNext/>
               <w:spacing w:before="40" w:after="40"/>
               <w:jc w:val="center"/>
             </w:pPr>
@@ -15618,6 +15859,9 @@
         </w:tc>
       </w:tr>
       <w:tr>
+        <w:trPr>
+          <w:cantSplit/>
+        </w:trPr>
         <w:tc>
           <w:tcPr>
             <w:tcW w:w="1400" w:type="pct"/>
@@ -15625,6 +15869,7 @@
           </w:tcPr>
           <w:p>
             <w:pPr>
+              <w:keepNext/>
               <w:spacing w:before="40" w:after="40"/>
               <w:jc w:val="center"/>
             </w:pPr>
@@ -15643,6 +15888,7 @@
           </w:tcPr>
           <w:p>
             <w:pPr>
+              <w:keepNext/>
               <w:spacing w:before="40" w:after="40"/>
               <w:jc w:val="center"/>
             </w:pPr>
@@ -15661,6 +15907,7 @@
           </w:tcPr>
           <w:p>
             <w:pPr>
+              <w:keepNext/>
               <w:spacing w:before="40" w:after="40"/>
               <w:jc w:val="center"/>
             </w:pPr>
@@ -15679,6 +15926,7 @@
           </w:tcPr>
           <w:p>
             <w:pPr>
+              <w:keepNext/>
               <w:spacing w:before="40" w:after="40"/>
               <w:jc w:val="center"/>
             </w:pPr>
@@ -15692,6 +15940,9 @@
         </w:tc>
       </w:tr>
       <w:tr>
+        <w:trPr>
+          <w:cantSplit/>
+        </w:trPr>
         <w:tc>
           <w:tcPr>
             <w:tcW w:w="1400" w:type="pct"/>
@@ -15699,6 +15950,7 @@
           </w:tcPr>
           <w:p>
             <w:pPr>
+              <w:keepNext/>
               <w:spacing w:before="40" w:after="40"/>
               <w:jc w:val="center"/>
             </w:pPr>
@@ -15717,6 +15969,7 @@
           </w:tcPr>
           <w:p>
             <w:pPr>
+              <w:keepNext/>
               <w:spacing w:before="40" w:after="40"/>
               <w:jc w:val="center"/>
             </w:pPr>
@@ -15735,6 +15988,7 @@
           </w:tcPr>
           <w:p>
             <w:pPr>
+              <w:keepNext/>
               <w:spacing w:before="40" w:after="40"/>
               <w:jc w:val="center"/>
             </w:pPr>
@@ -15753,6 +16007,7 @@
           </w:tcPr>
           <w:p>
             <w:pPr>
+              <w:keepNext/>
               <w:spacing w:before="40" w:after="40"/>
               <w:jc w:val="center"/>
             </w:pPr>
@@ -15766,6 +16021,9 @@
         </w:tc>
       </w:tr>
       <w:tr>
+        <w:trPr>
+          <w:cantSplit/>
+        </w:trPr>
         <w:tc>
           <w:tcPr>
             <w:tcW w:w="1400" w:type="pct"/>
@@ -15773,6 +16031,7 @@
           </w:tcPr>
           <w:p>
             <w:pPr>
+              <w:keepNext/>
               <w:spacing w:before="40" w:after="40"/>
               <w:jc w:val="center"/>
             </w:pPr>
@@ -15791,6 +16050,7 @@
           </w:tcPr>
           <w:p>
             <w:pPr>
+              <w:keepNext/>
               <w:spacing w:before="40" w:after="40"/>
               <w:jc w:val="center"/>
             </w:pPr>
@@ -15809,6 +16069,7 @@
           </w:tcPr>
           <w:p>
             <w:pPr>
+              <w:keepNext/>
               <w:spacing w:before="40" w:after="40"/>
               <w:jc w:val="center"/>
             </w:pPr>
@@ -15827,6 +16088,7 @@
           </w:tcPr>
           <w:p>
             <w:pPr>
+              <w:keepNext/>
               <w:spacing w:before="40" w:after="40"/>
               <w:jc w:val="center"/>
             </w:pPr>
@@ -15840,6 +16102,9 @@
         </w:tc>
       </w:tr>
       <w:tr>
+        <w:trPr>
+          <w:cantSplit/>
+        </w:trPr>
         <w:tc>
           <w:tcPr>
             <w:tcW w:w="1400" w:type="pct"/>
@@ -15847,6 +16112,7 @@
           </w:tcPr>
           <w:p>
             <w:pPr>
+              <w:keepNext/>
               <w:spacing w:before="40" w:after="40"/>
               <w:jc w:val="center"/>
             </w:pPr>
@@ -15876,6 +16142,7 @@
           </w:tcPr>
           <w:p>
             <w:pPr>
+              <w:keepNext/>
               <w:spacing w:before="40" w:after="40"/>
               <w:jc w:val="center"/>
             </w:pPr>
@@ -15894,6 +16161,7 @@
           </w:tcPr>
           <w:p>
             <w:pPr>
+              <w:keepNext/>
               <w:spacing w:before="40" w:after="40"/>
               <w:jc w:val="center"/>
             </w:pPr>
@@ -15912,6 +16180,7 @@
           </w:tcPr>
           <w:p>
             <w:pPr>
+              <w:keepNext/>
               <w:spacing w:before="40" w:after="40"/>
               <w:jc w:val="center"/>
             </w:pPr>
@@ -15925,6 +16194,9 @@
         </w:tc>
       </w:tr>
       <w:tr>
+        <w:trPr>
+          <w:cantSplit/>
+        </w:trPr>
         <w:tc>
           <w:tcPr>
             <w:tcW w:w="1400" w:type="pct"/>
@@ -16045,6 +16317,7 @@
     </w:p>
     <w:p>
       <w:pPr>
+        <w:keepNext/>
         <w:spacing w:before="200" w:after="100" w:line="360" w:lineRule="auto"/>
         <w:rPr>
           <w:b/>
@@ -16128,6 +16401,7 @@
       </w:tblGrid>
       <w:tr>
         <w:trPr>
+          <w:cantSplit/>
           <w:tblHeader/>
         </w:trPr>
         <w:tc>
@@ -16137,6 +16411,7 @@
           </w:tcPr>
           <w:p>
             <w:pPr>
+              <w:keepNext/>
               <w:spacing w:before="40" w:after="40"/>
               <w:jc w:val="center"/>
             </w:pPr>
@@ -16157,6 +16432,7 @@
           </w:tcPr>
           <w:p>
             <w:pPr>
+              <w:keepNext/>
               <w:spacing w:before="40" w:after="40"/>
               <w:jc w:val="center"/>
             </w:pPr>
@@ -16194,6 +16470,7 @@
           </w:tcPr>
           <w:p>
             <w:pPr>
+              <w:keepNext/>
               <w:spacing w:before="40" w:after="40"/>
               <w:jc w:val="center"/>
             </w:pPr>
@@ -16231,6 +16508,7 @@
           </w:tcPr>
           <w:p>
             <w:pPr>
+              <w:keepNext/>
               <w:spacing w:before="40" w:after="40"/>
               <w:jc w:val="center"/>
             </w:pPr>
@@ -16268,6 +16546,7 @@
           </w:tcPr>
           <w:p>
             <w:pPr>
+              <w:keepNext/>
               <w:spacing w:before="40" w:after="40"/>
               <w:jc w:val="center"/>
             </w:pPr>
@@ -16300,6 +16579,9 @@
         </w:tc>
       </w:tr>
       <w:tr>
+        <w:trPr>
+          <w:cantSplit/>
+        </w:trPr>
         <w:tc>
           <w:tcPr>
             <w:tcW w:w="1400" w:type="pct"/>
@@ -16307,6 +16589,7 @@
           </w:tcPr>
           <w:p>
             <w:pPr>
+              <w:keepNext/>
               <w:spacing w:before="40" w:after="40"/>
               <w:jc w:val="center"/>
             </w:pPr>
@@ -16325,6 +16608,7 @@
           </w:tcPr>
           <w:p>
             <w:pPr>
+              <w:keepNext/>
               <w:spacing w:before="40" w:after="40"/>
               <w:jc w:val="center"/>
             </w:pPr>
@@ -16343,6 +16627,7 @@
           </w:tcPr>
           <w:p>
             <w:pPr>
+              <w:keepNext/>
               <w:spacing w:before="40" w:after="40"/>
               <w:jc w:val="center"/>
             </w:pPr>
@@ -16361,6 +16646,7 @@
           </w:tcPr>
           <w:p>
             <w:pPr>
+              <w:keepNext/>
               <w:spacing w:before="40" w:after="40"/>
               <w:jc w:val="center"/>
             </w:pPr>
@@ -16379,6 +16665,7 @@
           </w:tcPr>
           <w:p>
             <w:pPr>
+              <w:keepNext/>
               <w:spacing w:before="40" w:after="40"/>
               <w:jc w:val="center"/>
             </w:pPr>
@@ -16392,6 +16679,9 @@
         </w:tc>
       </w:tr>
       <w:tr>
+        <w:trPr>
+          <w:cantSplit/>
+        </w:trPr>
         <w:tc>
           <w:tcPr>
             <w:tcW w:w="1400" w:type="pct"/>
@@ -16399,6 +16689,7 @@
           </w:tcPr>
           <w:p>
             <w:pPr>
+              <w:keepNext/>
               <w:spacing w:before="40" w:after="40"/>
               <w:jc w:val="center"/>
             </w:pPr>
@@ -16417,6 +16708,7 @@
           </w:tcPr>
           <w:p>
             <w:pPr>
+              <w:keepNext/>
               <w:spacing w:before="40" w:after="40"/>
               <w:jc w:val="center"/>
             </w:pPr>
@@ -16435,6 +16727,7 @@
           </w:tcPr>
           <w:p>
             <w:pPr>
+              <w:keepNext/>
               <w:spacing w:before="40" w:after="40"/>
               <w:jc w:val="center"/>
             </w:pPr>
@@ -16453,6 +16746,7 @@
           </w:tcPr>
           <w:p>
             <w:pPr>
+              <w:keepNext/>
               <w:spacing w:before="40" w:after="40"/>
               <w:jc w:val="center"/>
             </w:pPr>
@@ -16471,6 +16765,7 @@
           </w:tcPr>
           <w:p>
             <w:pPr>
+              <w:keepNext/>
               <w:spacing w:before="40" w:after="40"/>
               <w:jc w:val="center"/>
             </w:pPr>
@@ -16484,6 +16779,9 @@
         </w:tc>
       </w:tr>
       <w:tr>
+        <w:trPr>
+          <w:cantSplit/>
+        </w:trPr>
         <w:tc>
           <w:tcPr>
             <w:tcW w:w="1400" w:type="pct"/>
@@ -16491,6 +16789,7 @@
           </w:tcPr>
           <w:p>
             <w:pPr>
+              <w:keepNext/>
               <w:spacing w:before="40" w:after="40"/>
               <w:jc w:val="center"/>
             </w:pPr>
@@ -16509,6 +16808,7 @@
           </w:tcPr>
           <w:p>
             <w:pPr>
+              <w:keepNext/>
               <w:spacing w:before="40" w:after="40"/>
               <w:jc w:val="center"/>
             </w:pPr>
@@ -16527,6 +16827,7 @@
           </w:tcPr>
           <w:p>
             <w:pPr>
+              <w:keepNext/>
               <w:spacing w:before="40" w:after="40"/>
               <w:jc w:val="center"/>
             </w:pPr>
@@ -16545,6 +16846,7 @@
           </w:tcPr>
           <w:p>
             <w:pPr>
+              <w:keepNext/>
               <w:spacing w:before="40" w:after="40"/>
               <w:jc w:val="center"/>
             </w:pPr>
@@ -16563,6 +16865,7 @@
           </w:tcPr>
           <w:p>
             <w:pPr>
+              <w:keepNext/>
               <w:spacing w:before="40" w:after="40"/>
               <w:jc w:val="center"/>
             </w:pPr>
@@ -16576,6 +16879,9 @@
         </w:tc>
       </w:tr>
       <w:tr>
+        <w:trPr>
+          <w:cantSplit/>
+        </w:trPr>
         <w:tc>
           <w:tcPr>
             <w:tcW w:w="1400" w:type="pct"/>
@@ -16583,6 +16889,7 @@
           </w:tcPr>
           <w:p>
             <w:pPr>
+              <w:keepNext/>
               <w:spacing w:before="40" w:after="40"/>
               <w:jc w:val="center"/>
             </w:pPr>
@@ -16601,6 +16908,7 @@
           </w:tcPr>
           <w:p>
             <w:pPr>
+              <w:keepNext/>
               <w:spacing w:before="40" w:after="40"/>
               <w:jc w:val="center"/>
             </w:pPr>
@@ -16619,6 +16927,7 @@
           </w:tcPr>
           <w:p>
             <w:pPr>
+              <w:keepNext/>
               <w:spacing w:before="40" w:after="40"/>
               <w:jc w:val="center"/>
             </w:pPr>
@@ -16637,6 +16946,7 @@
           </w:tcPr>
           <w:p>
             <w:pPr>
+              <w:keepNext/>
               <w:spacing w:before="40" w:after="40"/>
               <w:jc w:val="center"/>
             </w:pPr>
@@ -16655,6 +16965,7 @@
           </w:tcPr>
           <w:p>
             <w:pPr>
+              <w:keepNext/>
               <w:spacing w:before="40" w:after="40"/>
               <w:jc w:val="center"/>
             </w:pPr>
@@ -16668,6 +16979,9 @@
         </w:tc>
       </w:tr>
       <w:tr>
+        <w:trPr>
+          <w:cantSplit/>
+        </w:trPr>
         <w:tc>
           <w:tcPr>
             <w:tcW w:w="1400" w:type="pct"/>
@@ -16675,6 +16989,7 @@
           </w:tcPr>
           <w:p>
             <w:pPr>
+              <w:keepNext/>
               <w:spacing w:before="40" w:after="40"/>
               <w:jc w:val="center"/>
             </w:pPr>
@@ -16693,6 +17008,7 @@
           </w:tcPr>
           <w:p>
             <w:pPr>
+              <w:keepNext/>
               <w:spacing w:before="40" w:after="40"/>
               <w:jc w:val="center"/>
             </w:pPr>
@@ -16711,6 +17027,7 @@
           </w:tcPr>
           <w:p>
             <w:pPr>
+              <w:keepNext/>
               <w:spacing w:before="40" w:after="40"/>
               <w:jc w:val="center"/>
             </w:pPr>
@@ -16729,6 +17046,7 @@
           </w:tcPr>
           <w:p>
             <w:pPr>
+              <w:keepNext/>
               <w:spacing w:before="40" w:after="40"/>
               <w:jc w:val="center"/>
             </w:pPr>
@@ -16747,6 +17065,7 @@
           </w:tcPr>
           <w:p>
             <w:pPr>
+              <w:keepNext/>
               <w:spacing w:before="40" w:after="40"/>
               <w:jc w:val="center"/>
             </w:pPr>
@@ -16760,6 +17079,9 @@
         </w:tc>
       </w:tr>
       <w:tr>
+        <w:trPr>
+          <w:cantSplit/>
+        </w:trPr>
         <w:tc>
           <w:tcPr>
             <w:tcW w:w="1400" w:type="pct"/>
@@ -16767,6 +17089,7 @@
           </w:tcPr>
           <w:p>
             <w:pPr>
+              <w:keepNext/>
               <w:spacing w:before="40" w:after="40"/>
               <w:jc w:val="center"/>
             </w:pPr>
@@ -16785,6 +17108,7 @@
           </w:tcPr>
           <w:p>
             <w:pPr>
+              <w:keepNext/>
               <w:spacing w:before="40" w:after="40"/>
               <w:jc w:val="center"/>
             </w:pPr>
@@ -16803,6 +17127,7 @@
           </w:tcPr>
           <w:p>
             <w:pPr>
+              <w:keepNext/>
               <w:spacing w:before="40" w:after="40"/>
               <w:jc w:val="center"/>
             </w:pPr>
@@ -16821,6 +17146,7 @@
           </w:tcPr>
           <w:p>
             <w:pPr>
+              <w:keepNext/>
               <w:spacing w:before="40" w:after="40"/>
               <w:jc w:val="center"/>
             </w:pPr>
@@ -16839,6 +17165,7 @@
           </w:tcPr>
           <w:p>
             <w:pPr>
+              <w:keepNext/>
               <w:spacing w:before="40" w:after="40"/>
               <w:jc w:val="center"/>
             </w:pPr>
@@ -16852,6 +17179,9 @@
         </w:tc>
       </w:tr>
       <w:tr>
+        <w:trPr>
+          <w:cantSplit/>
+        </w:trPr>
         <w:tc>
           <w:tcPr>
             <w:tcW w:w="1400" w:type="pct"/>
@@ -16859,6 +17189,7 @@
           </w:tcPr>
           <w:p>
             <w:pPr>
+              <w:keepNext/>
               <w:spacing w:before="40" w:after="40"/>
               <w:jc w:val="center"/>
             </w:pPr>
@@ -16877,6 +17208,7 @@
           </w:tcPr>
           <w:p>
             <w:pPr>
+              <w:keepNext/>
               <w:spacing w:before="40" w:after="40"/>
               <w:jc w:val="center"/>
             </w:pPr>
@@ -16895,6 +17227,7 @@
           </w:tcPr>
           <w:p>
             <w:pPr>
+              <w:keepNext/>
               <w:spacing w:before="40" w:after="40"/>
               <w:jc w:val="center"/>
             </w:pPr>
@@ -16913,6 +17246,7 @@
           </w:tcPr>
           <w:p>
             <w:pPr>
+              <w:keepNext/>
               <w:spacing w:before="40" w:after="40"/>
               <w:jc w:val="center"/>
             </w:pPr>
@@ -16931,6 +17265,7 @@
           </w:tcPr>
           <w:p>
             <w:pPr>
+              <w:keepNext/>
               <w:spacing w:before="40" w:after="40"/>
               <w:jc w:val="center"/>
             </w:pPr>
@@ -16944,6 +17279,9 @@
         </w:tc>
       </w:tr>
       <w:tr>
+        <w:trPr>
+          <w:cantSplit/>
+        </w:trPr>
         <w:tc>
           <w:tcPr>
             <w:tcW w:w="1400" w:type="pct"/>
@@ -16951,6 +17289,7 @@
           </w:tcPr>
           <w:p>
             <w:pPr>
+              <w:keepNext/>
               <w:spacing w:before="40" w:after="40"/>
               <w:jc w:val="center"/>
             </w:pPr>
@@ -16976,6 +17315,7 @@
           </w:tcPr>
           <w:p>
             <w:pPr>
+              <w:keepNext/>
               <w:spacing w:before="40" w:after="40"/>
               <w:jc w:val="center"/>
             </w:pPr>
@@ -16994,6 +17334,7 @@
           </w:tcPr>
           <w:p>
             <w:pPr>
+              <w:keepNext/>
               <w:spacing w:before="40" w:after="40"/>
               <w:jc w:val="center"/>
             </w:pPr>
@@ -17006,6 +17347,7 @@
           </w:tcPr>
           <w:p>
             <w:pPr>
+              <w:keepNext/>
               <w:spacing w:before="40" w:after="40"/>
               <w:jc w:val="center"/>
             </w:pPr>
@@ -17024,6 +17366,7 @@
           </w:tcPr>
           <w:p>
             <w:pPr>
+              <w:keepNext/>
               <w:spacing w:before="40" w:after="40"/>
               <w:jc w:val="center"/>
             </w:pPr>
@@ -17031,6 +17374,9 @@
         </w:tc>
       </w:tr>
       <w:tr>
+        <w:trPr>
+          <w:cantSplit/>
+        </w:trPr>
         <w:tc>
           <w:tcPr>
             <w:tcW w:w="1400" w:type="pct"/>
@@ -17038,6 +17384,7 @@
           </w:tcPr>
           <w:p>
             <w:pPr>
+              <w:keepNext/>
               <w:spacing w:before="40" w:after="40"/>
               <w:jc w:val="center"/>
             </w:pPr>
@@ -17069,6 +17416,7 @@
           </w:tcPr>
           <w:p>
             <w:pPr>
+              <w:keepNext/>
               <w:spacing w:before="40" w:after="40"/>
               <w:jc w:val="center"/>
             </w:pPr>
@@ -17087,6 +17435,7 @@
           </w:tcPr>
           <w:p>
             <w:pPr>
+              <w:keepNext/>
               <w:spacing w:before="40" w:after="40"/>
               <w:jc w:val="center"/>
             </w:pPr>
@@ -17099,6 +17448,7 @@
           </w:tcPr>
           <w:p>
             <w:pPr>
+              <w:keepNext/>
               <w:spacing w:before="40" w:after="40"/>
               <w:jc w:val="center"/>
             </w:pPr>
@@ -17117,6 +17467,7 @@
           </w:tcPr>
           <w:p>
             <w:pPr>
+              <w:keepNext/>
               <w:spacing w:before="40" w:after="40"/>
               <w:jc w:val="center"/>
             </w:pPr>
@@ -17124,6 +17475,9 @@
         </w:tc>
       </w:tr>
       <w:tr>
+        <w:trPr>
+          <w:cantSplit/>
+        </w:trPr>
         <w:tc>
           <w:tcPr>
             <w:tcW w:w="1400" w:type="pct"/>
@@ -17131,6 +17485,7 @@
           </w:tcPr>
           <w:p>
             <w:pPr>
+              <w:keepNext/>
               <w:spacing w:before="40" w:after="40"/>
               <w:jc w:val="center"/>
             </w:pPr>
@@ -17149,6 +17504,7 @@
           </w:tcPr>
           <w:p>
             <w:pPr>
+              <w:keepNext/>
               <w:spacing w:before="40" w:after="40"/>
               <w:jc w:val="center"/>
             </w:pPr>
@@ -17167,6 +17523,7 @@
           </w:tcPr>
           <w:p>
             <w:pPr>
+              <w:keepNext/>
               <w:spacing w:before="40" w:after="40"/>
               <w:jc w:val="center"/>
             </w:pPr>
@@ -17179,6 +17536,7 @@
           </w:tcPr>
           <w:p>
             <w:pPr>
+              <w:keepNext/>
               <w:spacing w:before="40" w:after="40"/>
               <w:jc w:val="center"/>
             </w:pPr>
@@ -17197,6 +17555,7 @@
           </w:tcPr>
           <w:p>
             <w:pPr>
+              <w:keepNext/>
               <w:spacing w:before="40" w:after="40"/>
               <w:jc w:val="center"/>
             </w:pPr>
@@ -17204,6 +17563,9 @@
         </w:tc>
       </w:tr>
       <w:tr>
+        <w:trPr>
+          <w:cantSplit/>
+        </w:trPr>
         <w:tc>
           <w:tcPr>
             <w:tcW w:w="1400" w:type="pct"/>
@@ -17434,6 +17796,7 @@
     </w:p>
     <w:p>
       <w:pPr>
+        <w:keepNext/>
         <w:spacing w:before="280" w:after="120" w:line="360" w:lineRule="auto"/>
         <w:jc w:val="center"/>
         <w:rPr>
@@ -17474,7 +17837,7 @@
       <w:r>
         <w:drawing>
           <wp:inline xmlns:a="http://schemas.openxmlformats.org/drawingml/2006/main" xmlns:pic="http://schemas.openxmlformats.org/drawingml/2006/picture">
-            <wp:extent cx="5486400" cy="6552230"/>
+            <wp:extent cx="4846320" cy="5787803"/>
             <wp:docPr id="1791909761" name="Picture 1791909761"/>
             <wp:cNvGraphicFramePr>
               <a:graphicFrameLocks noChangeAspect="1"/>
@@ -17495,7 +17858,7 @@
                   <pic:spPr>
                     <a:xfrm>
                       <a:off x="0" y="0"/>
-                      <a:ext cx="5486400" cy="6552230"/>
+                      <a:ext cx="4846320" cy="5787803"/>
                     </a:xfrm>
                     <a:prstGeom prst="rect"/>
                   </pic:spPr>
@@ -17551,7 +17914,7 @@
           <w:szCs w:val="22"/>
           <w:lang w:val="es-CO"/>
         </w:rPr>
-        <w:t xml:space="preserve">Fuente: elaboración propia con base en Solís Oyarzún (1997), Uribe Cáceres et al. (2016), Till (2007), Bueger y Edmunds (2024), Cabuya-Padilla y Castaneda-Marroquin (2022) y Cabuya-Padilla et al. (2025)</w:t>
+        <w:t xml:space="preserve">Fuente: elaboración propia.</w:t>
       </w:r>
     </w:p>
     <w:p>
@@ -17578,6 +17941,7 @@
     </w:p>
     <w:p>
       <w:pPr>
+        <w:keepNext/>
         <w:spacing w:before="280" w:after="120" w:line="360" w:lineRule="auto"/>
         <w:jc w:val="center"/>
         <w:rPr>
@@ -19095,6 +19459,7 @@
     </w:p>
     <w:p>
       <w:pPr>
+        <w:keepNext/>
         <w:spacing w:before="280" w:after="120" w:line="360" w:lineRule="auto"/>
         <w:jc w:val="center"/>
         <w:rPr>

</xml_diff>